<commit_message>
checkpoint 3/9/26/ complete untill planner tomorrow ai optimization
</commit_message>
<xml_diff>
--- a/backend/tests/resources/test_optimizer_v3_output.docx
+++ b/backend/tests/resources/test_optimizer_v3_output.docx
@@ -53,7 +53,7 @@
           <w:sz w:val="24"/>
           <w:szCs w:val="24"/>
         </w:rPr>
-        <w:t>Software Engineer | AI &amp; M</w:t>
+        <w:t>Software Engineer | AI &amp; ML Engineer | B</w:t>
       </w:r>
       <w:r>
         <w:rPr>
@@ -64,7 +64,7 @@
           <w:sz w:val="24"/>
           <w:szCs w:val="24"/>
         </w:rPr>
-        <w:t xml:space="preserve">L </w:t>
+        <w:t xml:space="preserve">ack</w:t>
       </w:r>
       <w:r>
         <w:rPr>
@@ -75,7 +75,7 @@
           <w:sz w:val="24"/>
           <w:szCs w:val="24"/>
         </w:rPr>
-        <w:t>Engineer</w:t>
+        <w:t>end Developer</w:t>
       </w:r>
     </w:p>
     <w:p>
@@ -573,21 +573,21 @@
           <w:w w:val="110"/>
           <w:lang w:val="en-IN"/>
         </w:rPr>
-        <w:t xml:space="preserve">Software Engineer and MCA graduate with hands-on experience in Python, Machine Learning, Deep Learning, and AI-based application development. Strong foundation in Object-Oriented Programming, Data Structures, and Software Engineering with a passion for </w:t>
-      </w:r>
-      <w:r>
-        <w:rPr>
-          <w:rFonts w:asciiTheme="minorHAnsi" w:hAnsiTheme="minorHAnsi" w:cstheme="minorHAnsi"/>
-          <w:w w:val="110"/>
-        </w:rPr>
-        <w:t>building AI-powered solutions</w:t>
-      </w:r>
-      <w:r>
-        <w:rPr>
-          <w:rFonts w:asciiTheme="minorHAnsi" w:hAnsiTheme="minorHAnsi" w:cstheme="minorHAnsi"/>
-          <w:w w:val="110"/>
-        </w:rPr>
-        <w:t xml:space="preserve"> </w:t>
+        <w:t xml:space="preserve">Software Engineer and MCA graduate with hands-on experience in Python, Machine Learning, Deep Learning, and AI-based application development. Strong foundation in Object-Oriented Programming, Data Structures, and Software Engineering with expertise in FastAPI for backend development. Passionate abou</w:t>
+      </w:r>
+      <w:r>
+        <w:rPr>
+          <w:rFonts w:asciiTheme="minorHAnsi" w:hAnsiTheme="minorHAnsi" w:cstheme="minorHAnsi"/>
+          <w:w w:val="110"/>
+        </w:rPr>
+        <w:t>t building scalable AI-powered sol</w:t>
+      </w:r>
+      <w:r>
+        <w:rPr>
+          <w:rFonts w:asciiTheme="minorHAnsi" w:hAnsiTheme="minorHAnsi" w:cstheme="minorHAnsi"/>
+          <w:w w:val="110"/>
+        </w:rPr>
+        <w:t xml:space="preserve">u</w:t>
       </w:r>
       <w:r>
         <w:rPr>
@@ -595,7 +595,7 @@
           <w:w w:val="110"/>
           <w:lang w:val="en-IN"/>
         </w:rPr>
-        <w:t>and solving real-world problems.</w:t>
+        <w:t>tions and solving real-world problems.</w:t>
       </w:r>
     </w:p>
     <w:p>
@@ -1746,7 +1746,7 @@
           <w:b/>
           <w:bCs/>
         </w:rPr>
-        <w:t>Tools &amp; Platforms</w:t>
+        <w:t>Tools &amp; Platforms: </w:t>
       </w:r>
       <w:r>
         <w:rPr>
@@ -1755,34 +1755,34 @@
           <w:bCs/>
           <w:lang w:val="en-IN"/>
         </w:rPr>
-        <w:t>:</w:t>
+        <w:t>G</w:t>
       </w:r>
       <w:r>
         <w:rPr>
           <w:rFonts w:asciiTheme="minorHAnsi" w:hAnsiTheme="minorHAnsi" w:cstheme="minorHAnsi"/>
           <w:lang w:val="en-IN"/>
         </w:rPr>
-        <w:t xml:space="preserve"> </w:t>
-      </w:r>
-      <w:r>
-        <w:rPr>
-          <w:rFonts w:asciiTheme="minorHAnsi" w:hAnsiTheme="minorHAnsi" w:cstheme="minorHAnsi"/>
-        </w:rPr>
-        <w:t xml:space="preserve">Git, GitHub, </w:t>
+        <w:t xml:space="preserve">i</w:t>
+      </w:r>
+      <w:r>
+        <w:rPr>
+          <w:rFonts w:asciiTheme="minorHAnsi" w:hAnsiTheme="minorHAnsi" w:cstheme="minorHAnsi"/>
+        </w:rPr>
+        <w:t xml:space="preserve">t, GitHub, Stre</w:t>
       </w:r>
       <w:proofErr w:type="spellStart"/>
       <w:r>
         <w:rPr>
           <w:rFonts w:asciiTheme="minorHAnsi" w:hAnsiTheme="minorHAnsi" w:cstheme="minorHAnsi"/>
         </w:rPr>
-        <w:t>Streamlit</w:t>
+        <w:t>amlit, Fir</w:t>
       </w:r>
       <w:proofErr w:type="spellEnd"/>
       <w:r>
         <w:rPr>
           <w:rFonts w:asciiTheme="minorHAnsi" w:hAnsiTheme="minorHAnsi" w:cstheme="minorHAnsi"/>
         </w:rPr>
-        <w:t>, Firebase, Postman</w:t>
+        <w:t>ebase, Postman, Docker</w:t>
       </w:r>
     </w:p>
     <w:p>

</xml_diff>